<commit_message>
docs: replace practical 1 VS Code evidence with Terminal
</commit_message>
<xml_diff>
--- a/reports/Отчет_Практическая_работа_1_Инструменты_Девопс_Изосимов_МИ_проверено.docx
+++ b/reports/Отчет_Практическая_работа_1_Инструменты_Девопс_Изосимов_МИ_проверено.docx
@@ -554,7 +554,7 @@
       <w:r>
         <w:drawing>
           <wp:inline xmlns:a="http://schemas.openxmlformats.org/drawingml/2006/main" xmlns:pic="http://schemas.openxmlformats.org/drawingml/2006/picture">
-            <wp:extent cx="5616000" cy="3417661"/>
+            <wp:extent cx="5616000" cy="3427005"/>
             <wp:docPr id="1" name="Picture 1"/>
             <wp:cNvGraphicFramePr>
               <a:graphicFrameLocks noChangeAspect="1"/>
@@ -563,7 +563,7 @@
               <a:graphicData uri="http://schemas.openxmlformats.org/drawingml/2006/picture">
                 <pic:pic>
                   <pic:nvPicPr>
-                    <pic:cNvPr id="0" name="06-git-and-ssh.png"/>
+                    <pic:cNvPr id="0" name="12-practical1-terminal-git-ssh.png"/>
                     <pic:cNvPicPr/>
                   </pic:nvPicPr>
                   <pic:blipFill>
@@ -575,7 +575,7 @@
                   <pic:spPr>
                     <a:xfrm>
                       <a:off x="0" y="0"/>
-                      <a:ext cx="5616000" cy="3417661"/>
+                      <a:ext cx="5616000" cy="3427005"/>
                     </a:xfrm>
                     <a:prstGeom prst="rect"/>
                   </pic:spPr>
@@ -596,7 +596,7 @@
           <w:i/>
           <w:sz w:val="20"/>
         </w:rPr>
-        <w:t>Рисунок 1 - Проверка настроек Git, удалённого репозитория и SSH-подключения</w:t>
+        <w:t>Рисунок 1 - Проверка настроек Git, удалённого репозитория и SSH-подключения в Terminal</w:t>
       </w:r>
     </w:p>
     <w:p>

</xml_diff>